<commit_message>
fix(redact): preserve schema instance attributes
</commit_message>
<xml_diff>
--- a/crates/ooxml-redact/tests/fixtures/redaction-integrity.docx
+++ b/crates/ooxml-redact/tests/fixtures/redaction-integrity.docx
@@ -86,8 +86,10 @@
 </file>
 
 <file path=customXml/item4.xml><?xml version="1.0" encoding="utf-8"?>
-<data xmlns="urn:synthetic:data">
+<data xmlns="urn:synthetic:data" xmlns:xsi="http://www.w3.org/2001/XMLSchema-instance" xmlns:xs="http://www.w3.org/2001/XMLSchema" xsi:schemaLocation="urn:synthetic:data https://secret.example/schema.xsd">
   <value>SECRET_OTHER_PRIVATE</value>
+  <missing xsi:nil="true"/>
+  <typed xsi:type="xs:string">SECRET_TYPED_VALUE</typed>
 </data>
 </file>
 

</xml_diff>